<commit_message>
Industry: new Appendices 3-7 in report format (tables from the team spec, charts ind2/ind1/ind7), Porter and EBITDA/m2 figures regenerated from the new team files, spec and v7 reference stored
Co-Authored-By: Claude Sonnet 5.5 <noreply@anthropic.com>
Claude-Session: https://claude.ai/code/session_0188QZHBkA8n5QL7BtmFakQg
</commit_message>
<xml_diff>
--- a/secciones/industria/documento/Mallplaza_Industria_EN.docx
+++ b/secciones/industria/documento/Mallplaza_Industria_EN.docx
@@ -267,7 +267,8 @@
           </w:tcPr>
           <w:p>
             <w:pPr>
-              <w:spacing w:after="30" w:before="20" w:line="228" w:lineRule="auto"/>
+              <w:keepLines/>
+              <w:spacing w:after="20" w:before="20" w:line="240" w:lineRule="auto"/>
             </w:pPr>
             <w:r>
               <w:rPr>
@@ -289,11 +290,9 @@
               </w:rPr>
               <w:t xml:space="preserve">Market share by GLA and concentration, 2Q26</w:t>
             </w:r>
-          </w:p>
-          <w:p>
-            <w:pPr>
-              <w:spacing w:after="20" w:before="0" w:line="240" w:lineRule="auto"/>
-            </w:pPr>
+            <w:r>
+              <w:br/>
+            </w:r>
             <w:r>
               <w:drawing>
                 <wp:inline distT="0" distB="0" distL="0" distR="0">
@@ -334,11 +333,9 @@
                 </wp:inline>
               </w:drawing>
             </w:r>
-          </w:p>
-          <w:p>
-            <w:pPr>
-              <w:spacing w:after="0" w:before="10" w:line="216" w:lineRule="auto"/>
-            </w:pPr>
+            <w:r>
+              <w:br/>
+            </w:r>
             <w:r>
               <w:rPr>
                 <w:rFonts w:ascii="Arial" w:cs="Arial" w:eastAsia="Arial" w:hAnsi="Arial"/>
@@ -364,7 +361,8 @@
           </w:p>
           <w:p>
             <w:pPr>
-              <w:spacing w:after="30" w:before="90" w:line="228" w:lineRule="auto"/>
+              <w:keepLines/>
+              <w:spacing w:after="20" w:before="90" w:line="240" w:lineRule="auto"/>
             </w:pPr>
             <w:r>
               <w:rPr>
@@ -386,11 +384,9 @@
               </w:rPr>
               <w:t xml:space="preserve">New GLA supply in Chile vs expected private consumption, 2026-2028</w:t>
             </w:r>
-          </w:p>
-          <w:p>
-            <w:pPr>
-              <w:spacing w:after="20" w:before="0" w:line="240" w:lineRule="auto"/>
-            </w:pPr>
+            <w:r>
+              <w:br/>
+            </w:r>
             <w:r>
               <w:drawing>
                 <wp:inline distT="0" distB="0" distL="0" distR="0">
@@ -431,11 +427,9 @@
                 </wp:inline>
               </w:drawing>
             </w:r>
-          </w:p>
-          <w:p>
-            <w:pPr>
-              <w:spacing w:after="0" w:before="10" w:line="216" w:lineRule="auto"/>
-            </w:pPr>
+            <w:r>
+              <w:br/>
+            </w:r>
             <w:r>
               <w:rPr>
                 <w:rFonts w:ascii="Arial" w:cs="Arial" w:eastAsia="Arial" w:hAnsi="Arial"/>
@@ -461,24 +455,6 @@
           </w:p>
         </w:tc>
       </w:tr>
-    </w:tbl>
-    <w:tbl>
-      <w:tblPr>
-        <w:tblW w:type="dxa" w:w="10666"/>
-        <w:tblBorders>
-          <w:top w:val="none" w:color="FFFFFF" w:sz="0"/>
-          <w:left w:val="none" w:color="FFFFFF" w:sz="0"/>
-          <w:bottom w:val="none" w:color="FFFFFF" w:sz="0"/>
-          <w:right w:val="none" w:color="FFFFFF" w:sz="0"/>
-          <w:insideH w:val="none" w:color="FFFFFF" w:sz="0"/>
-          <w:insideV w:val="none" w:color="FFFFFF" w:sz="0"/>
-        </w:tblBorders>
-      </w:tblPr>
-      <w:tblGrid>
-        <w:gridCol w:w="6900"/>
-        <w:gridCol w:w="216"/>
-        <w:gridCol w:w="3550"/>
-      </w:tblGrid>
       <w:tr>
         <w:tc>
           <w:tcPr>
@@ -755,7 +731,8 @@
           </w:tcPr>
           <w:p>
             <w:pPr>
-              <w:spacing w:after="30" w:before="20" w:line="228" w:lineRule="auto"/>
+              <w:keepLines/>
+              <w:spacing w:after="20" w:before="20" w:line="240" w:lineRule="auto"/>
             </w:pPr>
             <w:r>
               <w:rPr>
@@ -777,11 +754,9 @@
               </w:rPr>
               <w:t xml:space="preserve">Porter's five forces, 1-5 scale</w:t>
             </w:r>
-          </w:p>
-          <w:p>
-            <w:pPr>
-              <w:spacing w:after="20" w:before="0" w:line="240" w:lineRule="auto"/>
-            </w:pPr>
+            <w:r>
+              <w:br/>
+            </w:r>
             <w:r>
               <w:drawing>
                 <wp:inline distT="0" distB="0" distL="0" distR="0">
@@ -822,11 +797,9 @@
                 </wp:inline>
               </w:drawing>
             </w:r>
-          </w:p>
-          <w:p>
-            <w:pPr>
-              <w:spacing w:after="0" w:before="10" w:line="216" w:lineRule="auto"/>
-            </w:pPr>
+            <w:r>
+              <w:br/>
+            </w:r>
             <w:r>
               <w:rPr>
                 <w:rFonts w:ascii="Arial" w:cs="Arial" w:eastAsia="Arial" w:hAnsi="Arial"/>
@@ -852,7 +825,8 @@
           </w:p>
           <w:p>
             <w:pPr>
-              <w:spacing w:after="30" w:before="90" w:line="228" w:lineRule="auto"/>
+              <w:keepLines/>
+              <w:spacing w:after="20" w:before="90" w:line="240" w:lineRule="auto"/>
             </w:pPr>
             <w:r>
               <w:rPr>
@@ -874,11 +848,9 @@
               </w:rPr>
               <w:t xml:space="preserve">EBITDA per m² of GLA, 2Q26 quarterly (CLP)</w:t>
             </w:r>
-          </w:p>
-          <w:p>
-            <w:pPr>
-              <w:spacing w:after="20" w:before="0" w:line="240" w:lineRule="auto"/>
-            </w:pPr>
+            <w:r>
+              <w:br/>
+            </w:r>
             <w:r>
               <w:drawing>
                 <wp:inline distT="0" distB="0" distL="0" distR="0">
@@ -919,11 +891,9 @@
                 </wp:inline>
               </w:drawing>
             </w:r>
-          </w:p>
-          <w:p>
-            <w:pPr>
-              <w:spacing w:after="0" w:before="10" w:line="216" w:lineRule="auto"/>
-            </w:pPr>
+            <w:r>
+              <w:br/>
+            </w:r>
             <w:r>
               <w:rPr>
                 <w:rFonts w:ascii="Arial" w:cs="Arial" w:eastAsia="Arial" w:hAnsi="Arial"/>
@@ -949,7 +919,8 @@
           </w:p>
           <w:p>
             <w:pPr>
-              <w:spacing w:after="30" w:before="90" w:line="228" w:lineRule="auto"/>
+              <w:keepLines/>
+              <w:spacing w:after="20" w:before="90" w:line="240" w:lineRule="auto"/>
             </w:pPr>
             <w:r>
               <w:rPr>
@@ -971,11 +942,9 @@
               </w:rPr>
               <w:t xml:space="preserve">Lease expiry profile (% of GLA) and weighted average remaining term, 2Q26</w:t>
             </w:r>
-          </w:p>
-          <w:p>
-            <w:pPr>
-              <w:spacing w:after="20" w:before="0" w:line="240" w:lineRule="auto"/>
-            </w:pPr>
+            <w:r>
+              <w:br/>
+            </w:r>
             <w:r>
               <w:drawing>
                 <wp:inline distT="0" distB="0" distL="0" distR="0">
@@ -1016,11 +985,9 @@
                 </wp:inline>
               </w:drawing>
             </w:r>
-          </w:p>
-          <w:p>
-            <w:pPr>
-              <w:spacing w:after="0" w:before="10" w:line="216" w:lineRule="auto"/>
-            </w:pPr>
+            <w:r>
+              <w:br/>
+            </w:r>
             <w:r>
               <w:rPr>
                 <w:rFonts w:ascii="Arial" w:cs="Arial" w:eastAsia="Arial" w:hAnsi="Arial"/>

</xml_diff>